<commit_message>
Added figures to methods/results
</commit_message>
<xml_diff>
--- a/Manuscript/Dicerandra_Microbiome_Statistical_Methods.docx
+++ b/Manuscript/Dicerandra_Microbiome_Statistical_Methods.docx
@@ -26,10 +26,7 @@
         <w:pStyle w:val="Heading2"/>
       </w:pPr>
       <w:r>
-        <w:t>D</w:t>
-      </w:r>
-      <w:r>
-        <w:t>ata preparation</w:t>
+        <w:t>Data preparation</w:t>
       </w:r>
     </w:p>
     <w:p>
@@ -547,10 +544,7 @@
         <w:pStyle w:val="Heading2"/>
       </w:pPr>
       <w:r>
-        <w:t xml:space="preserve">Poster-Specific - </w:t>
-      </w:r>
-      <w:r>
-        <w:t>Sensitivity analysis</w:t>
+        <w:t>Poster-Specific - Sensitivity analysis</w:t>
       </w:r>
     </w:p>
     <w:p>
@@ -599,6 +593,49 @@
         <w:t xml:space="preserve"> effects after multiple-test correction. Tests of multivariate dispersion detected no significant heterogeneity among sites for any compartment, indicating that PERMANOVA results primarily reflected shifts in community composition rather than differences in within-site variance.</w:t>
       </w:r>
     </w:p>
+    <w:p/>
+    <w:p>
+      <w:r>
+        <w:rPr>
+          <w:noProof/>
+        </w:rPr>
+        <w:drawing>
+          <wp:inline distT="0" distB="0" distL="0" distR="0" wp14:anchorId="297D2C71" wp14:editId="185BD054">
+            <wp:extent cx="6126480" cy="3676015"/>
+            <wp:effectExtent l="0" t="0" r="0" b="0"/>
+            <wp:docPr id="759775022" name="Picture 1"/>
+            <wp:cNvGraphicFramePr>
+              <a:graphicFrameLocks xmlns:a="http://schemas.openxmlformats.org/drawingml/2006/main" noChangeAspect="1"/>
+            </wp:cNvGraphicFramePr>
+            <a:graphic xmlns:a="http://schemas.openxmlformats.org/drawingml/2006/main">
+              <a:graphicData uri="http://schemas.openxmlformats.org/drawingml/2006/picture">
+                <pic:pic xmlns:pic="http://schemas.openxmlformats.org/drawingml/2006/picture">
+                  <pic:nvPicPr>
+                    <pic:cNvPr id="759775022" name="Picture 759775022"/>
+                    <pic:cNvPicPr/>
+                  </pic:nvPicPr>
+                  <pic:blipFill>
+                    <a:blip r:embed="rId8"/>
+                    <a:stretch>
+                      <a:fillRect/>
+                    </a:stretch>
+                  </pic:blipFill>
+                  <pic:spPr>
+                    <a:xfrm>
+                      <a:off x="0" y="0"/>
+                      <a:ext cx="6126480" cy="3676015"/>
+                    </a:xfrm>
+                    <a:prstGeom prst="rect">
+                      <a:avLst/>
+                    </a:prstGeom>
+                  </pic:spPr>
+                </pic:pic>
+              </a:graphicData>
+            </a:graphic>
+          </wp:inline>
+        </w:drawing>
+      </w:r>
+    </w:p>
     <w:p>
       <w:pPr>
         <w:pStyle w:val="Heading2"/>
@@ -621,6 +658,50 @@
       <w:proofErr w:type="spellEnd"/>
       <w:r>
         <w:t xml:space="preserve"> effects. Significant positive coordination occurred only among biologically adjacent compartments (Fig. 2). Plants with more similar bulk-soil microbiomes also had more similar rhizosphere microbiomes, and rhizosphere similarity predicted root similarity. Likewise, leaf epiphyte and leaf endophyte microbiomes covaried strongly, and fruit epiphytes and fruit endophytes also exhibited positive coordination. In contrast, no significant relationships linked belowground and leaf microbiomes, belowground and fruit microbiomes, or leaf and fruit microbiomes after correcting for multiple testing. Thus, microbiome turnover appears coordinated within organ-specific pathways but not across major plant organs.</w:t>
+      </w:r>
+    </w:p>
+    <w:p/>
+    <w:p>
+      <w:r>
+        <w:rPr>
+          <w:noProof/>
+        </w:rPr>
+        <w:lastRenderedPageBreak/>
+        <w:drawing>
+          <wp:inline distT="0" distB="0" distL="0" distR="0" wp14:anchorId="52997D2D" wp14:editId="1C5B3F44">
+            <wp:extent cx="6126480" cy="5615940"/>
+            <wp:effectExtent l="0" t="0" r="0" b="0"/>
+            <wp:docPr id="1024457395" name="Picture 2"/>
+            <wp:cNvGraphicFramePr>
+              <a:graphicFrameLocks xmlns:a="http://schemas.openxmlformats.org/drawingml/2006/main" noChangeAspect="1"/>
+            </wp:cNvGraphicFramePr>
+            <a:graphic xmlns:a="http://schemas.openxmlformats.org/drawingml/2006/main">
+              <a:graphicData uri="http://schemas.openxmlformats.org/drawingml/2006/picture">
+                <pic:pic xmlns:pic="http://schemas.openxmlformats.org/drawingml/2006/picture">
+                  <pic:nvPicPr>
+                    <pic:cNvPr id="1024457395" name="Picture 1024457395"/>
+                    <pic:cNvPicPr/>
+                  </pic:nvPicPr>
+                  <pic:blipFill>
+                    <a:blip r:embed="rId9"/>
+                    <a:stretch>
+                      <a:fillRect/>
+                    </a:stretch>
+                  </pic:blipFill>
+                  <pic:spPr>
+                    <a:xfrm>
+                      <a:off x="0" y="0"/>
+                      <a:ext cx="6126480" cy="5615940"/>
+                    </a:xfrm>
+                    <a:prstGeom prst="rect">
+                      <a:avLst/>
+                    </a:prstGeom>
+                  </pic:spPr>
+                </pic:pic>
+              </a:graphicData>
+            </a:graphic>
+          </wp:inline>
+        </w:drawing>
       </w:r>
     </w:p>
     <w:p>
@@ -649,8 +730,104 @@
       </w:r>
       <w:proofErr w:type="spellEnd"/>
       <w:r>
-        <w:t xml:space="preserve"> = 6, P = 3.36 × 10⁻⁵). Estimated among-site minus within-site differences were largest for leaf epiphytes, leaf endophytes, rhizosphere soil, and bulk soil, intermediate for roots, and smallest for both fruit microbiomes. Pairwise comparisons confirmed that both fruit compartments exhibited significantly weaker site structuring than leaf epiphytes and weaker trends than several belowground compartments after Benjamini–Hochberg correction. These results indicate that while leaves and belowground tissues maintain strong site-associated community similarity, fruit microbiomes remain comparatively variable regardless of whether fruits originate from the same or different sites.</w:t>
+        <w:t xml:space="preserve"> = 6, P = 3.36 × 10⁻⁵). Estimated among-site minus within-site differences were largest for leaf epiphytes, leaf endophytes, rhizosphere soil, and bulk soil, intermediate for roots, and smallest for both fruit microbiomes. Pairwise comparisons confirmed that both fruit compartments exhibited significantly weaker site structuring than leaf epiphytes and weaker trends than several belowground compartments after Benjamini–Hochberg correction. These results indicate that while leaves and belowground tissues maintain strong site-associated community similarity, fruit microbiomes </w:t>
       </w:r>
+      <w:r>
+        <w:lastRenderedPageBreak/>
+        <w:t>remain comparatively variable regardless of whether fruits originate from the same or different sites.</w:t>
+      </w:r>
+    </w:p>
+    <w:p/>
+    <w:p/>
+    <w:p>
+      <w:r>
+        <w:rPr>
+          <w:noProof/>
+        </w:rPr>
+        <w:drawing>
+          <wp:inline distT="0" distB="0" distL="0" distR="0" wp14:anchorId="10A6EA67" wp14:editId="5CB67BF6">
+            <wp:extent cx="6126480" cy="4288790"/>
+            <wp:effectExtent l="0" t="0" r="0" b="3810"/>
+            <wp:docPr id="1181364619" name="Picture 4"/>
+            <wp:cNvGraphicFramePr>
+              <a:graphicFrameLocks xmlns:a="http://schemas.openxmlformats.org/drawingml/2006/main" noChangeAspect="1"/>
+            </wp:cNvGraphicFramePr>
+            <a:graphic xmlns:a="http://schemas.openxmlformats.org/drawingml/2006/main">
+              <a:graphicData uri="http://schemas.openxmlformats.org/drawingml/2006/picture">
+                <pic:pic xmlns:pic="http://schemas.openxmlformats.org/drawingml/2006/picture">
+                  <pic:nvPicPr>
+                    <pic:cNvPr id="1181364619" name="Picture 1181364619"/>
+                    <pic:cNvPicPr/>
+                  </pic:nvPicPr>
+                  <pic:blipFill>
+                    <a:blip r:embed="rId10"/>
+                    <a:stretch>
+                      <a:fillRect/>
+                    </a:stretch>
+                  </pic:blipFill>
+                  <pic:spPr>
+                    <a:xfrm>
+                      <a:off x="0" y="0"/>
+                      <a:ext cx="6126480" cy="4288790"/>
+                    </a:xfrm>
+                    <a:prstGeom prst="rect">
+                      <a:avLst/>
+                    </a:prstGeom>
+                  </pic:spPr>
+                </pic:pic>
+              </a:graphicData>
+            </a:graphic>
+          </wp:inline>
+        </w:drawing>
+      </w:r>
+    </w:p>
+    <w:p>
+      <w:r>
+        <w:rPr>
+          <w:noProof/>
+        </w:rPr>
+        <w:lastRenderedPageBreak/>
+        <w:drawing>
+          <wp:inline distT="0" distB="0" distL="0" distR="0" wp14:anchorId="7B2A47D8" wp14:editId="79A5FE8E">
+            <wp:extent cx="6126480" cy="4084320"/>
+            <wp:effectExtent l="0" t="0" r="0" b="5080"/>
+            <wp:docPr id="1809879579" name="Picture 3"/>
+            <wp:cNvGraphicFramePr>
+              <a:graphicFrameLocks xmlns:a="http://schemas.openxmlformats.org/drawingml/2006/main" noChangeAspect="1"/>
+            </wp:cNvGraphicFramePr>
+            <a:graphic xmlns:a="http://schemas.openxmlformats.org/drawingml/2006/main">
+              <a:graphicData uri="http://schemas.openxmlformats.org/drawingml/2006/picture">
+                <pic:pic xmlns:pic="http://schemas.openxmlformats.org/drawingml/2006/picture">
+                  <pic:nvPicPr>
+                    <pic:cNvPr id="1809879579" name="Picture 1809879579"/>
+                    <pic:cNvPicPr/>
+                  </pic:nvPicPr>
+                  <pic:blipFill>
+                    <a:blip r:embed="rId11"/>
+                    <a:stretch>
+                      <a:fillRect/>
+                    </a:stretch>
+                  </pic:blipFill>
+                  <pic:spPr>
+                    <a:xfrm>
+                      <a:off x="0" y="0"/>
+                      <a:ext cx="6126480" cy="4084320"/>
+                    </a:xfrm>
+                    <a:prstGeom prst="rect">
+                      <a:avLst/>
+                    </a:prstGeom>
+                  </pic:spPr>
+                </pic:pic>
+              </a:graphicData>
+            </a:graphic>
+          </wp:inline>
+        </w:drawing>
+      </w:r>
+    </w:p>
+    <w:p>
+      <w:pPr>
+        <w:pStyle w:val="Heading2"/>
+      </w:pPr>
     </w:p>
     <w:p>
       <w:pPr>
@@ -667,9 +844,9 @@
     </w:p>
     <w:p/>
     <w:sectPr>
-      <w:headerReference w:type="default" r:id="rId8"/>
-      <w:footerReference w:type="even" r:id="rId9"/>
-      <w:footerReference w:type="default" r:id="rId10"/>
+      <w:headerReference w:type="default" r:id="rId12"/>
+      <w:footerReference w:type="even" r:id="rId13"/>
+      <w:footerReference w:type="default" r:id="rId14"/>
       <w:pgSz w:w="12240" w:h="15840"/>
       <w:pgMar w:top="1152" w:right="1296" w:bottom="1152" w:left="1296" w:header="720" w:footer="720" w:gutter="0"/>
       <w:cols w:space="720"/>
@@ -1695,6 +1872,7 @@
   <w:style w:type="character" w:default="1" w:styleId="DefaultParagraphFont">
     <w:name w:val="Default Paragraph Font"/>
     <w:uiPriority w:val="1"/>
+    <w:semiHidden/>
     <w:unhideWhenUsed/>
   </w:style>
   <w:style w:type="table" w:default="1" w:styleId="TableNormal">

</xml_diff>